<commit_message>
Update team members: Rohith Thayalan 23MIA1104, Sandeep 23MIA1040, Sastika 23MIA1047
</commit_message>
<xml_diff>
--- a/DA2_Report_Microplastic_Analytics.docx
+++ b/DA2_Report_Microplastic_Analytics.docx
@@ -174,7 +174,7 @@
               <w:rPr>
                 <w:sz w:val="22"/>
               </w:rPr>
-              <w:t>Rohit Sharma</w:t>
+              <w:t>Rohith Thayalan</w:t>
             </w:r>
           </w:p>
         </w:tc>
@@ -224,7 +224,7 @@
               <w:rPr>
                 <w:sz w:val="22"/>
               </w:rPr>
-              <w:t>Team Member 2</w:t>
+              <w:t>Sandeep</w:t>
             </w:r>
           </w:p>
         </w:tc>
@@ -240,7 +240,7 @@
               <w:rPr>
                 <w:sz w:val="22"/>
               </w:rPr>
-              <w:t>23MIAXXXX</w:t>
+              <w:t>23MIA1040</w:t>
             </w:r>
           </w:p>
         </w:tc>
@@ -274,7 +274,7 @@
               <w:rPr>
                 <w:sz w:val="22"/>
               </w:rPr>
-              <w:t>Team Member 3</w:t>
+              <w:t>Sastika</w:t>
             </w:r>
           </w:p>
         </w:tc>
@@ -290,7 +290,7 @@
               <w:rPr>
                 <w:sz w:val="22"/>
               </w:rPr>
-              <w:t>23MIAXXXX</w:t>
+              <w:t>23MIA1047</w:t>
             </w:r>
           </w:p>
         </w:tc>

</xml_diff>